<commit_message>
chore: update PDF and document background assets
</commit_message>
<xml_diff>
--- a/sphinx-docs/{{ cookiecutter.repo_name }}/_static/pdf/page-background.docx
+++ b/sphinx-docs/{{ cookiecutter.repo_name }}/_static/pdf/page-background.docx
@@ -2,6 +2,7 @@
 <file path=word/document.xml><?xml version="1.0" encoding="utf-8"?>
 <w:document xmlns:wpc="http://schemas.microsoft.com/office/word/2010/wordprocessingCanvas" xmlns:cx="http://schemas.microsoft.com/office/drawing/2014/chartex" xmlns:cx1="http://schemas.microsoft.com/office/drawing/2015/9/8/chartex" xmlns:cx2="http://schemas.microsoft.com/office/drawing/2015/10/21/chartex" xmlns:cx3="http://schemas.microsoft.com/office/drawing/2016/5/9/chartex" xmlns:cx4="http://schemas.microsoft.com/office/drawing/2016/5/10/chartex" xmlns:cx5="http://schemas.microsoft.com/office/drawing/2016/5/11/chartex" xmlns:cx6="http://schemas.microsoft.com/office/drawing/2016/5/12/chartex" xmlns:cx7="http://schemas.microsoft.com/office/drawing/2016/5/13/chartex" xmlns:cx8="http://schemas.microsoft.com/office/drawing/2016/5/14/chartex" xmlns:mc="http://schemas.openxmlformats.org/markup-compatibility/2006" xmlns:aink="http://schemas.microsoft.com/office/drawing/2016/ink" xmlns:am3d="http://schemas.microsoft.com/office/drawing/2017/model3d" xmlns:o="urn:schemas-microsoft-com:office:office" xmlns:oel="http://schemas.microsoft.com/office/2019/extlst" xmlns:r="http://schemas.openxmlformats.org/officeDocument/2006/relationships" xmlns:m="http://schemas.openxmlformats.org/officeDocument/2006/math" xmlns:v="urn:schemas-microsoft-com:vml" xmlns:wp14="http://schemas.microsoft.com/office/word/2010/wordprocessingDrawing" xmlns:wp="http://schemas.openxmlformats.org/drawingml/2006/wordprocessingDrawing" xmlns:w10="urn:schemas-microsoft-com:office:word" xmlns:w="http://schemas.openxmlformats.org/wordprocessingml/2006/main" xmlns:w14="http://schemas.microsoft.com/office/word/2010/wordml" xmlns:w15="http://schemas.microsoft.com/office/word/2012/wordml" xmlns:w16cex="http://schemas.microsoft.com/office/word/2018/wordml/cex" xmlns:w16cid="http://schemas.microsoft.com/office/word/2016/wordml/cid" xmlns:w16="http://schemas.microsoft.com/office/word/2018/wordml" xmlns:w16du="http://schemas.microsoft.com/office/word/2023/wordml/word16du" xmlns:w16sdtdh="http://schemas.microsoft.com/office/word/2020/wordml/sdtdatahash" xmlns:w16sdtfl="http://schemas.microsoft.com/office/word/2024/wordml/sdtformatlock" xmlns:w16se="http://schemas.microsoft.com/office/word/2015/wordml/symex" xmlns:wpg="http://schemas.microsoft.com/office/word/2010/wordprocessingGroup" xmlns:wpi="http://schemas.microsoft.com/office/word/2010/wordprocessingInk" xmlns:wne="http://schemas.microsoft.com/office/word/2006/wordml" xmlns:wps="http://schemas.microsoft.com/office/word/2010/wordprocessingShape" mc:Ignorable="w14 w15 w16se w16cid w16 w16cex w16sdtdh w16sdtfl w16du wp14">
   <w:body>
+    <w:p/>
     <w:p/>
     <w:sectPr>
       <w:headerReference w:type="default" r:id="rId6"/>
@@ -44,7 +45,7 @@
 <w:ftr xmlns:wpc="http://schemas.microsoft.com/office/word/2010/wordprocessingCanvas" xmlns:cx="http://schemas.microsoft.com/office/drawing/2014/chartex" xmlns:cx1="http://schemas.microsoft.com/office/drawing/2015/9/8/chartex" xmlns:cx2="http://schemas.microsoft.com/office/drawing/2015/10/21/chartex" xmlns:cx3="http://schemas.microsoft.com/office/drawing/2016/5/9/chartex" xmlns:cx4="http://schemas.microsoft.com/office/drawing/2016/5/10/chartex" xmlns:cx5="http://schemas.microsoft.com/office/drawing/2016/5/11/chartex" xmlns:cx6="http://schemas.microsoft.com/office/drawing/2016/5/12/chartex" xmlns:cx7="http://schemas.microsoft.com/office/drawing/2016/5/13/chartex" xmlns:cx8="http://schemas.microsoft.com/office/drawing/2016/5/14/chartex" xmlns:mc="http://schemas.openxmlformats.org/markup-compatibility/2006" xmlns:aink="http://schemas.microsoft.com/office/drawing/2016/ink" xmlns:am3d="http://schemas.microsoft.com/office/drawing/2017/model3d" xmlns:o="urn:schemas-microsoft-com:office:office" xmlns:oel="http://schemas.microsoft.com/office/2019/extlst" xmlns:r="http://schemas.openxmlformats.org/officeDocument/2006/relationships" xmlns:m="http://schemas.openxmlformats.org/officeDocument/2006/math" xmlns:v="urn:schemas-microsoft-com:vml" xmlns:wp14="http://schemas.microsoft.com/office/word/2010/wordprocessingDrawing" xmlns:wp="http://schemas.openxmlformats.org/drawingml/2006/wordprocessingDrawing" xmlns:w10="urn:schemas-microsoft-com:office:word" xmlns:w="http://schemas.openxmlformats.org/wordprocessingml/2006/main" xmlns:w14="http://schemas.microsoft.com/office/word/2010/wordml" xmlns:w15="http://schemas.microsoft.com/office/word/2012/wordml" xmlns:w16cex="http://schemas.microsoft.com/office/word/2018/wordml/cex" xmlns:w16cid="http://schemas.microsoft.com/office/word/2016/wordml/cid" xmlns:w16="http://schemas.microsoft.com/office/word/2018/wordml" xmlns:w16du="http://schemas.microsoft.com/office/word/2023/wordml/word16du" xmlns:w16sdtdh="http://schemas.microsoft.com/office/word/2020/wordml/sdtdatahash" xmlns:w16sdtfl="http://schemas.microsoft.com/office/word/2024/wordml/sdtformatlock" xmlns:w16se="http://schemas.microsoft.com/office/word/2015/wordml/symex" xmlns:wpg="http://schemas.microsoft.com/office/word/2010/wordprocessingGroup" xmlns:wpi="http://schemas.microsoft.com/office/word/2010/wordprocessingInk" xmlns:wne="http://schemas.microsoft.com/office/word/2006/wordml" xmlns:wps="http://schemas.microsoft.com/office/word/2010/wordprocessingShape" mc:Ignorable="w14 w15 w16se w16cid w16 w16cex w16sdtdh w16sdtfl w16du wp14">
   <w:p>
     <w:pPr>
-      <w:pStyle w:val="Footer"/>
+      <w:pStyle w:val="Pieddepage"/>
     </w:pPr>
     <w:r>
       <w:rPr>
@@ -53,7 +54,7 @@
       <mc:AlternateContent>
         <mc:Choice Requires="wps">
           <w:drawing>
-            <wp:anchor distT="0" distB="0" distL="114300" distR="114300" simplePos="0" relativeHeight="251659264" behindDoc="0" locked="0" layoutInCell="1" allowOverlap="1" wp14:anchorId="3A12607B" wp14:editId="2C99FDC8">
+            <wp:anchor distT="0" distB="0" distL="114300" distR="114300" simplePos="0" relativeHeight="251659264" behindDoc="0" locked="0" layoutInCell="1" allowOverlap="1" wp14:anchorId="3A12607B" wp14:editId="39287542">
               <wp:simplePos x="0" y="0"/>
               <wp:positionH relativeFrom="page">
                 <wp:posOffset>7438030</wp:posOffset>
@@ -79,7 +80,7 @@
                         <a:avLst/>
                       </a:prstGeom>
                       <a:solidFill>
-                        <a:srgbClr val="E2001A"/>
+                        <a:schemeClr val="tx2"/>
                       </a:solidFill>
                       <a:ln>
                         <a:noFill/>
@@ -121,7 +122,7 @@
         </mc:Choice>
         <mc:Fallback>
           <w:pict>
-            <v:rect w14:anchorId="7DEEC2D8" id="Rectangle 2" o:spid="_x0000_s1026" style="position:absolute;margin-left:585.65pt;margin-top:-96.55pt;width:10.4pt;height:145.05pt;z-index:251659264;visibility:visible;mso-wrap-style:square;mso-width-percent:0;mso-height-percent:0;mso-wrap-distance-left:9pt;mso-wrap-distance-top:0;mso-wrap-distance-right:9pt;mso-wrap-distance-bottom:0;mso-position-horizontal:absolute;mso-position-horizontal-relative:page;mso-position-vertical:absolute;mso-position-vertical-relative:text;mso-width-percent:0;mso-height-percent:0;mso-width-relative:margin;mso-height-relative:margin;v-text-anchor:middle" o:gfxdata="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" fillcolor="#e2001a" stroked="f" strokeweight="1.5pt">
+            <v:rect w14:anchorId="2912D59B" id="Rectangle 2" o:spid="_x0000_s1026" style="position:absolute;margin-left:585.65pt;margin-top:-96.55pt;width:10.4pt;height:145.05pt;z-index:251659264;visibility:visible;mso-wrap-style:square;mso-width-percent:0;mso-height-percent:0;mso-wrap-distance-left:9pt;mso-wrap-distance-top:0;mso-wrap-distance-right:9pt;mso-wrap-distance-bottom:0;mso-position-horizontal:absolute;mso-position-horizontal-relative:page;mso-position-vertical:absolute;mso-position-vertical-relative:text;mso-width-percent:0;mso-height-percent:0;mso-width-relative:margin;mso-height-relative:margin;v-text-anchor:middle" o:gfxdata="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" fillcolor="#0e2841 [3215]" stroked="f" strokeweight="1.5pt">
               <w10:wrap anchorx="page"/>
             </v:rect>
           </w:pict>
@@ -161,33 +162,25 @@
 <w:hdr xmlns:wpc="http://schemas.microsoft.com/office/word/2010/wordprocessingCanvas" xmlns:cx="http://schemas.microsoft.com/office/drawing/2014/chartex" xmlns:cx1="http://schemas.microsoft.com/office/drawing/2015/9/8/chartex" xmlns:cx2="http://schemas.microsoft.com/office/drawing/2015/10/21/chartex" xmlns:cx3="http://schemas.microsoft.com/office/drawing/2016/5/9/chartex" xmlns:cx4="http://schemas.microsoft.com/office/drawing/2016/5/10/chartex" xmlns:cx5="http://schemas.microsoft.com/office/drawing/2016/5/11/chartex" xmlns:cx6="http://schemas.microsoft.com/office/drawing/2016/5/12/chartex" xmlns:cx7="http://schemas.microsoft.com/office/drawing/2016/5/13/chartex" xmlns:cx8="http://schemas.microsoft.com/office/drawing/2016/5/14/chartex" xmlns:mc="http://schemas.openxmlformats.org/markup-compatibility/2006" xmlns:aink="http://schemas.microsoft.com/office/drawing/2016/ink" xmlns:am3d="http://schemas.microsoft.com/office/drawing/2017/model3d" xmlns:o="urn:schemas-microsoft-com:office:office" xmlns:oel="http://schemas.microsoft.com/office/2019/extlst" xmlns:r="http://schemas.openxmlformats.org/officeDocument/2006/relationships" xmlns:m="http://schemas.openxmlformats.org/officeDocument/2006/math" xmlns:v="urn:schemas-microsoft-com:vml" xmlns:wp14="http://schemas.microsoft.com/office/word/2010/wordprocessingDrawing" xmlns:wp="http://schemas.openxmlformats.org/drawingml/2006/wordprocessingDrawing" xmlns:w10="urn:schemas-microsoft-com:office:word" xmlns:w="http://schemas.openxmlformats.org/wordprocessingml/2006/main" xmlns:w14="http://schemas.microsoft.com/office/word/2010/wordml" xmlns:w15="http://schemas.microsoft.com/office/word/2012/wordml" xmlns:w16cex="http://schemas.microsoft.com/office/word/2018/wordml/cex" xmlns:w16cid="http://schemas.microsoft.com/office/word/2016/wordml/cid" xmlns:w16="http://schemas.microsoft.com/office/word/2018/wordml" xmlns:w16du="http://schemas.microsoft.com/office/word/2023/wordml/word16du" xmlns:w16sdtdh="http://schemas.microsoft.com/office/word/2020/wordml/sdtdatahash" xmlns:w16sdtfl="http://schemas.microsoft.com/office/word/2024/wordml/sdtformatlock" xmlns:w16se="http://schemas.microsoft.com/office/word/2015/wordml/symex" xmlns:wpg="http://schemas.microsoft.com/office/word/2010/wordprocessingGroup" xmlns:wpi="http://schemas.microsoft.com/office/word/2010/wordprocessingInk" xmlns:wne="http://schemas.microsoft.com/office/word/2006/wordml" xmlns:wps="http://schemas.microsoft.com/office/word/2010/wordprocessingShape" mc:Ignorable="w14 w15 w16se w16cid w16 w16cex w16sdtdh w16sdtfl w16du wp14">
   <w:p>
     <w:pPr>
-      <w:pStyle w:val="Header"/>
+      <w:pStyle w:val="En-tte"/>
     </w:pPr>
     <w:r>
       <w:rPr>
         <w:noProof/>
       </w:rPr>
       <w:drawing>
-        <wp:anchor distT="0" distB="0" distL="114300" distR="114300" simplePos="0" relativeHeight="251660288" behindDoc="1" locked="0" layoutInCell="1" allowOverlap="1" wp14:anchorId="05F04AC7" wp14:editId="34F75349">
+        <wp:anchor distT="0" distB="0" distL="114300" distR="114300" simplePos="0" relativeHeight="251661312" behindDoc="0" locked="0" layoutInCell="1" allowOverlap="1" wp14:anchorId="0CD3DADE" wp14:editId="093CA23D">
           <wp:simplePos x="0" y="0"/>
           <wp:positionH relativeFrom="column">
-            <wp:posOffset>531154</wp:posOffset>
+            <wp:posOffset>424815</wp:posOffset>
           </wp:positionH>
           <wp:positionV relativeFrom="paragraph">
-            <wp:posOffset>635</wp:posOffset>
+            <wp:posOffset>-123190</wp:posOffset>
           </wp:positionV>
-          <wp:extent cx="590550" cy="590550"/>
+          <wp:extent cx="838200" cy="838200"/>
           <wp:effectExtent l="0" t="0" r="0" b="0"/>
-          <wp:wrapTight wrapText="bothSides">
-            <wp:wrapPolygon edited="0">
-              <wp:start x="0" y="0"/>
-              <wp:lineTo x="0" y="20903"/>
-              <wp:lineTo x="20903" y="20903"/>
-              <wp:lineTo x="20903" y="0"/>
-              <wp:lineTo x="0" y="0"/>
-            </wp:wrapPolygon>
-          </wp:wrapTight>
-          <wp:docPr id="902099703" name="Picture 1"/>
+          <wp:wrapSquare wrapText="bothSides"/>
+          <wp:docPr id="344109932" name="Image 2"/>
           <wp:cNvGraphicFramePr>
             <a:graphicFrameLocks xmlns:a="http://schemas.openxmlformats.org/drawingml/2006/main" noChangeAspect="1"/>
           </wp:cNvGraphicFramePr>
@@ -216,7 +209,7 @@
                 <pic:spPr bwMode="auto">
                   <a:xfrm>
                     <a:off x="0" y="0"/>
-                    <a:ext cx="590550" cy="590550"/>
+                    <a:ext cx="838200" cy="838200"/>
                   </a:xfrm>
                   <a:prstGeom prst="rect">
                     <a:avLst/>
@@ -643,11 +636,11 @@
     <w:name w:val="Normal"/>
     <w:qFormat/>
   </w:style>
-  <w:style w:type="paragraph" w:styleId="Heading1">
+  <w:style w:type="paragraph" w:styleId="Titre1">
     <w:name w:val="heading 1"/>
     <w:basedOn w:val="Normal"/>
     <w:next w:val="Normal"/>
-    <w:link w:val="Heading1Char"/>
+    <w:link w:val="Titre1Car"/>
     <w:uiPriority w:val="9"/>
     <w:qFormat/>
     <w:rsid w:val="00054634"/>
@@ -664,11 +657,11 @@
       <w:szCs w:val="40"/>
     </w:rPr>
   </w:style>
-  <w:style w:type="paragraph" w:styleId="Heading2">
+  <w:style w:type="paragraph" w:styleId="Titre2">
     <w:name w:val="heading 2"/>
     <w:basedOn w:val="Normal"/>
     <w:next w:val="Normal"/>
-    <w:link w:val="Heading2Char"/>
+    <w:link w:val="Titre2Car"/>
     <w:uiPriority w:val="9"/>
     <w:semiHidden/>
     <w:unhideWhenUsed/>
@@ -687,11 +680,11 @@
       <w:szCs w:val="32"/>
     </w:rPr>
   </w:style>
-  <w:style w:type="paragraph" w:styleId="Heading3">
+  <w:style w:type="paragraph" w:styleId="Titre3">
     <w:name w:val="heading 3"/>
     <w:basedOn w:val="Normal"/>
     <w:next w:val="Normal"/>
-    <w:link w:val="Heading3Char"/>
+    <w:link w:val="Titre3Car"/>
     <w:uiPriority w:val="9"/>
     <w:semiHidden/>
     <w:unhideWhenUsed/>
@@ -710,11 +703,11 @@
       <w:szCs w:val="28"/>
     </w:rPr>
   </w:style>
-  <w:style w:type="paragraph" w:styleId="Heading4">
+  <w:style w:type="paragraph" w:styleId="Titre4">
     <w:name w:val="heading 4"/>
     <w:basedOn w:val="Normal"/>
     <w:next w:val="Normal"/>
-    <w:link w:val="Heading4Char"/>
+    <w:link w:val="Titre4Car"/>
     <w:uiPriority w:val="9"/>
     <w:semiHidden/>
     <w:unhideWhenUsed/>
@@ -733,11 +726,11 @@
       <w:color w:val="0F4761" w:themeColor="accent1" w:themeShade="BF"/>
     </w:rPr>
   </w:style>
-  <w:style w:type="paragraph" w:styleId="Heading5">
+  <w:style w:type="paragraph" w:styleId="Titre5">
     <w:name w:val="heading 5"/>
     <w:basedOn w:val="Normal"/>
     <w:next w:val="Normal"/>
-    <w:link w:val="Heading5Char"/>
+    <w:link w:val="Titre5Car"/>
     <w:uiPriority w:val="9"/>
     <w:semiHidden/>
     <w:unhideWhenUsed/>
@@ -754,11 +747,11 @@
       <w:color w:val="0F4761" w:themeColor="accent1" w:themeShade="BF"/>
     </w:rPr>
   </w:style>
-  <w:style w:type="paragraph" w:styleId="Heading6">
+  <w:style w:type="paragraph" w:styleId="Titre6">
     <w:name w:val="heading 6"/>
     <w:basedOn w:val="Normal"/>
     <w:next w:val="Normal"/>
-    <w:link w:val="Heading6Char"/>
+    <w:link w:val="Titre6Car"/>
     <w:uiPriority w:val="9"/>
     <w:semiHidden/>
     <w:unhideWhenUsed/>
@@ -777,11 +770,11 @@
       <w:color w:val="595959" w:themeColor="text1" w:themeTint="A6"/>
     </w:rPr>
   </w:style>
-  <w:style w:type="paragraph" w:styleId="Heading7">
+  <w:style w:type="paragraph" w:styleId="Titre7">
     <w:name w:val="heading 7"/>
     <w:basedOn w:val="Normal"/>
     <w:next w:val="Normal"/>
-    <w:link w:val="Heading7Char"/>
+    <w:link w:val="Titre7Car"/>
     <w:uiPriority w:val="9"/>
     <w:semiHidden/>
     <w:unhideWhenUsed/>
@@ -798,11 +791,11 @@
       <w:color w:val="595959" w:themeColor="text1" w:themeTint="A6"/>
     </w:rPr>
   </w:style>
-  <w:style w:type="paragraph" w:styleId="Heading8">
+  <w:style w:type="paragraph" w:styleId="Titre8">
     <w:name w:val="heading 8"/>
     <w:basedOn w:val="Normal"/>
     <w:next w:val="Normal"/>
-    <w:link w:val="Heading8Char"/>
+    <w:link w:val="Titre8Car"/>
     <w:uiPriority w:val="9"/>
     <w:semiHidden/>
     <w:unhideWhenUsed/>
@@ -821,11 +814,11 @@
       <w:color w:val="272727" w:themeColor="text1" w:themeTint="D8"/>
     </w:rPr>
   </w:style>
-  <w:style w:type="paragraph" w:styleId="Heading9">
+  <w:style w:type="paragraph" w:styleId="Titre9">
     <w:name w:val="heading 9"/>
     <w:basedOn w:val="Normal"/>
     <w:next w:val="Normal"/>
-    <w:link w:val="Heading9Char"/>
+    <w:link w:val="Titre9Car"/>
     <w:uiPriority w:val="9"/>
     <w:semiHidden/>
     <w:unhideWhenUsed/>
@@ -842,13 +835,13 @@
       <w:color w:val="272727" w:themeColor="text1" w:themeTint="D8"/>
     </w:rPr>
   </w:style>
-  <w:style w:type="character" w:default="1" w:styleId="DefaultParagraphFont">
+  <w:style w:type="character" w:default="1" w:styleId="Policepardfaut">
     <w:name w:val="Default Paragraph Font"/>
     <w:uiPriority w:val="1"/>
     <w:semiHidden/>
     <w:unhideWhenUsed/>
   </w:style>
-  <w:style w:type="table" w:default="1" w:styleId="TableNormal">
+  <w:style w:type="table" w:default="1" w:styleId="TableauNormal">
     <w:name w:val="Normal Table"/>
     <w:uiPriority w:val="99"/>
     <w:semiHidden/>
@@ -863,16 +856,16 @@
       </w:tblCellMar>
     </w:tblPr>
   </w:style>
-  <w:style w:type="numbering" w:default="1" w:styleId="NoList">
+  <w:style w:type="numbering" w:default="1" w:styleId="Aucuneliste">
     <w:name w:val="No List"/>
     <w:uiPriority w:val="99"/>
     <w:semiHidden/>
     <w:unhideWhenUsed/>
   </w:style>
-  <w:style w:type="character" w:customStyle="1" w:styleId="Heading1Char">
-    <w:name w:val="Heading 1 Char"/>
-    <w:basedOn w:val="DefaultParagraphFont"/>
-    <w:link w:val="Heading1"/>
+  <w:style w:type="character" w:customStyle="1" w:styleId="Titre1Car">
+    <w:name w:val="Titre 1 Car"/>
+    <w:basedOn w:val="Policepardfaut"/>
+    <w:link w:val="Titre1"/>
     <w:uiPriority w:val="9"/>
     <w:rsid w:val="00054634"/>
     <w:rPr>
@@ -882,10 +875,10 @@
       <w:szCs w:val="40"/>
     </w:rPr>
   </w:style>
-  <w:style w:type="character" w:customStyle="1" w:styleId="Heading2Char">
-    <w:name w:val="Heading 2 Char"/>
-    <w:basedOn w:val="DefaultParagraphFont"/>
-    <w:link w:val="Heading2"/>
+  <w:style w:type="character" w:customStyle="1" w:styleId="Titre2Car">
+    <w:name w:val="Titre 2 Car"/>
+    <w:basedOn w:val="Policepardfaut"/>
+    <w:link w:val="Titre2"/>
     <w:uiPriority w:val="9"/>
     <w:semiHidden/>
     <w:rsid w:val="00054634"/>
@@ -896,10 +889,10 @@
       <w:szCs w:val="32"/>
     </w:rPr>
   </w:style>
-  <w:style w:type="character" w:customStyle="1" w:styleId="Heading3Char">
-    <w:name w:val="Heading 3 Char"/>
-    <w:basedOn w:val="DefaultParagraphFont"/>
-    <w:link w:val="Heading3"/>
+  <w:style w:type="character" w:customStyle="1" w:styleId="Titre3Car">
+    <w:name w:val="Titre 3 Car"/>
+    <w:basedOn w:val="Policepardfaut"/>
+    <w:link w:val="Titre3"/>
     <w:uiPriority w:val="9"/>
     <w:semiHidden/>
     <w:rsid w:val="00054634"/>
@@ -910,10 +903,10 @@
       <w:szCs w:val="28"/>
     </w:rPr>
   </w:style>
-  <w:style w:type="character" w:customStyle="1" w:styleId="Heading4Char">
-    <w:name w:val="Heading 4 Char"/>
-    <w:basedOn w:val="DefaultParagraphFont"/>
-    <w:link w:val="Heading4"/>
+  <w:style w:type="character" w:customStyle="1" w:styleId="Titre4Car">
+    <w:name w:val="Titre 4 Car"/>
+    <w:basedOn w:val="Policepardfaut"/>
+    <w:link w:val="Titre4"/>
     <w:uiPriority w:val="9"/>
     <w:semiHidden/>
     <w:rsid w:val="00054634"/>
@@ -924,10 +917,10 @@
       <w:color w:val="0F4761" w:themeColor="accent1" w:themeShade="BF"/>
     </w:rPr>
   </w:style>
-  <w:style w:type="character" w:customStyle="1" w:styleId="Heading5Char">
-    <w:name w:val="Heading 5 Char"/>
-    <w:basedOn w:val="DefaultParagraphFont"/>
-    <w:link w:val="Heading5"/>
+  <w:style w:type="character" w:customStyle="1" w:styleId="Titre5Car">
+    <w:name w:val="Titre 5 Car"/>
+    <w:basedOn w:val="Policepardfaut"/>
+    <w:link w:val="Titre5"/>
     <w:uiPriority w:val="9"/>
     <w:semiHidden/>
     <w:rsid w:val="00054634"/>
@@ -936,10 +929,10 @@
       <w:color w:val="0F4761" w:themeColor="accent1" w:themeShade="BF"/>
     </w:rPr>
   </w:style>
-  <w:style w:type="character" w:customStyle="1" w:styleId="Heading6Char">
-    <w:name w:val="Heading 6 Char"/>
-    <w:basedOn w:val="DefaultParagraphFont"/>
-    <w:link w:val="Heading6"/>
+  <w:style w:type="character" w:customStyle="1" w:styleId="Titre6Car">
+    <w:name w:val="Titre 6 Car"/>
+    <w:basedOn w:val="Policepardfaut"/>
+    <w:link w:val="Titre6"/>
     <w:uiPriority w:val="9"/>
     <w:semiHidden/>
     <w:rsid w:val="00054634"/>
@@ -950,10 +943,10 @@
       <w:color w:val="595959" w:themeColor="text1" w:themeTint="A6"/>
     </w:rPr>
   </w:style>
-  <w:style w:type="character" w:customStyle="1" w:styleId="Heading7Char">
-    <w:name w:val="Heading 7 Char"/>
-    <w:basedOn w:val="DefaultParagraphFont"/>
-    <w:link w:val="Heading7"/>
+  <w:style w:type="character" w:customStyle="1" w:styleId="Titre7Car">
+    <w:name w:val="Titre 7 Car"/>
+    <w:basedOn w:val="Policepardfaut"/>
+    <w:link w:val="Titre7"/>
     <w:uiPriority w:val="9"/>
     <w:semiHidden/>
     <w:rsid w:val="00054634"/>
@@ -962,10 +955,10 @@
       <w:color w:val="595959" w:themeColor="text1" w:themeTint="A6"/>
     </w:rPr>
   </w:style>
-  <w:style w:type="character" w:customStyle="1" w:styleId="Heading8Char">
-    <w:name w:val="Heading 8 Char"/>
-    <w:basedOn w:val="DefaultParagraphFont"/>
-    <w:link w:val="Heading8"/>
+  <w:style w:type="character" w:customStyle="1" w:styleId="Titre8Car">
+    <w:name w:val="Titre 8 Car"/>
+    <w:basedOn w:val="Policepardfaut"/>
+    <w:link w:val="Titre8"/>
     <w:uiPriority w:val="9"/>
     <w:semiHidden/>
     <w:rsid w:val="00054634"/>
@@ -976,10 +969,10 @@
       <w:color w:val="272727" w:themeColor="text1" w:themeTint="D8"/>
     </w:rPr>
   </w:style>
-  <w:style w:type="character" w:customStyle="1" w:styleId="Heading9Char">
-    <w:name w:val="Heading 9 Char"/>
-    <w:basedOn w:val="DefaultParagraphFont"/>
-    <w:link w:val="Heading9"/>
+  <w:style w:type="character" w:customStyle="1" w:styleId="Titre9Car">
+    <w:name w:val="Titre 9 Car"/>
+    <w:basedOn w:val="Policepardfaut"/>
+    <w:link w:val="Titre9"/>
     <w:uiPriority w:val="9"/>
     <w:semiHidden/>
     <w:rsid w:val="00054634"/>
@@ -988,11 +981,11 @@
       <w:color w:val="272727" w:themeColor="text1" w:themeTint="D8"/>
     </w:rPr>
   </w:style>
-  <w:style w:type="paragraph" w:styleId="Title">
+  <w:style w:type="paragraph" w:styleId="Titre">
     <w:name w:val="Title"/>
     <w:basedOn w:val="Normal"/>
     <w:next w:val="Normal"/>
-    <w:link w:val="TitleChar"/>
+    <w:link w:val="TitreCar"/>
     <w:uiPriority w:val="10"/>
     <w:qFormat/>
     <w:rsid w:val="00054634"/>
@@ -1008,10 +1001,10 @@
       <w:szCs w:val="56"/>
     </w:rPr>
   </w:style>
-  <w:style w:type="character" w:customStyle="1" w:styleId="TitleChar">
-    <w:name w:val="Title Char"/>
-    <w:basedOn w:val="DefaultParagraphFont"/>
-    <w:link w:val="Title"/>
+  <w:style w:type="character" w:customStyle="1" w:styleId="TitreCar">
+    <w:name w:val="Titre Car"/>
+    <w:basedOn w:val="Policepardfaut"/>
+    <w:link w:val="Titre"/>
     <w:uiPriority w:val="10"/>
     <w:rsid w:val="00054634"/>
     <w:rPr>
@@ -1022,11 +1015,11 @@
       <w:szCs w:val="56"/>
     </w:rPr>
   </w:style>
-  <w:style w:type="paragraph" w:styleId="Subtitle">
+  <w:style w:type="paragraph" w:styleId="Sous-titre">
     <w:name w:val="Subtitle"/>
     <w:basedOn w:val="Normal"/>
     <w:next w:val="Normal"/>
-    <w:link w:val="SubtitleChar"/>
+    <w:link w:val="Sous-titreCar"/>
     <w:uiPriority w:val="11"/>
     <w:qFormat/>
     <w:rsid w:val="00054634"/>
@@ -1043,10 +1036,10 @@
       <w:szCs w:val="28"/>
     </w:rPr>
   </w:style>
-  <w:style w:type="character" w:customStyle="1" w:styleId="SubtitleChar">
-    <w:name w:val="Subtitle Char"/>
-    <w:basedOn w:val="DefaultParagraphFont"/>
-    <w:link w:val="Subtitle"/>
+  <w:style w:type="character" w:customStyle="1" w:styleId="Sous-titreCar">
+    <w:name w:val="Sous-titre Car"/>
+    <w:basedOn w:val="Policepardfaut"/>
+    <w:link w:val="Sous-titre"/>
     <w:uiPriority w:val="11"/>
     <w:rsid w:val="00054634"/>
     <w:rPr>
@@ -1057,11 +1050,11 @@
       <w:szCs w:val="28"/>
     </w:rPr>
   </w:style>
-  <w:style w:type="paragraph" w:styleId="Quote">
+  <w:style w:type="paragraph" w:styleId="Citation">
     <w:name w:val="Quote"/>
     <w:basedOn w:val="Normal"/>
     <w:next w:val="Normal"/>
-    <w:link w:val="QuoteChar"/>
+    <w:link w:val="CitationCar"/>
     <w:uiPriority w:val="29"/>
     <w:qFormat/>
     <w:rsid w:val="00054634"/>
@@ -1075,10 +1068,10 @@
       <w:color w:val="404040" w:themeColor="text1" w:themeTint="BF"/>
     </w:rPr>
   </w:style>
-  <w:style w:type="character" w:customStyle="1" w:styleId="QuoteChar">
-    <w:name w:val="Quote Char"/>
-    <w:basedOn w:val="DefaultParagraphFont"/>
-    <w:link w:val="Quote"/>
+  <w:style w:type="character" w:customStyle="1" w:styleId="CitationCar">
+    <w:name w:val="Citation Car"/>
+    <w:basedOn w:val="Policepardfaut"/>
+    <w:link w:val="Citation"/>
     <w:uiPriority w:val="29"/>
     <w:rsid w:val="00054634"/>
     <w:rPr>
@@ -1087,7 +1080,7 @@
       <w:color w:val="404040" w:themeColor="text1" w:themeTint="BF"/>
     </w:rPr>
   </w:style>
-  <w:style w:type="paragraph" w:styleId="ListParagraph">
+  <w:style w:type="paragraph" w:styleId="Paragraphedeliste">
     <w:name w:val="List Paragraph"/>
     <w:basedOn w:val="Normal"/>
     <w:uiPriority w:val="34"/>
@@ -1098,9 +1091,9 @@
       <w:contextualSpacing/>
     </w:pPr>
   </w:style>
-  <w:style w:type="character" w:styleId="IntenseEmphasis">
+  <w:style w:type="character" w:styleId="Accentuationintense">
     <w:name w:val="Intense Emphasis"/>
-    <w:basedOn w:val="DefaultParagraphFont"/>
+    <w:basedOn w:val="Policepardfaut"/>
     <w:uiPriority w:val="21"/>
     <w:qFormat/>
     <w:rsid w:val="00054634"/>
@@ -1110,11 +1103,11 @@
       <w:color w:val="0F4761" w:themeColor="accent1" w:themeShade="BF"/>
     </w:rPr>
   </w:style>
-  <w:style w:type="paragraph" w:styleId="IntenseQuote">
+  <w:style w:type="paragraph" w:styleId="Citationintense">
     <w:name w:val="Intense Quote"/>
     <w:basedOn w:val="Normal"/>
     <w:next w:val="Normal"/>
-    <w:link w:val="IntenseQuoteChar"/>
+    <w:link w:val="CitationintenseCar"/>
     <w:uiPriority w:val="30"/>
     <w:qFormat/>
     <w:rsid w:val="00054634"/>
@@ -1133,10 +1126,10 @@
       <w:color w:val="0F4761" w:themeColor="accent1" w:themeShade="BF"/>
     </w:rPr>
   </w:style>
-  <w:style w:type="character" w:customStyle="1" w:styleId="IntenseQuoteChar">
-    <w:name w:val="Intense Quote Char"/>
-    <w:basedOn w:val="DefaultParagraphFont"/>
-    <w:link w:val="IntenseQuote"/>
+  <w:style w:type="character" w:customStyle="1" w:styleId="CitationintenseCar">
+    <w:name w:val="Citation intense Car"/>
+    <w:basedOn w:val="Policepardfaut"/>
+    <w:link w:val="Citationintense"/>
     <w:uiPriority w:val="30"/>
     <w:rsid w:val="00054634"/>
     <w:rPr>
@@ -1145,9 +1138,9 @@
       <w:color w:val="0F4761" w:themeColor="accent1" w:themeShade="BF"/>
     </w:rPr>
   </w:style>
-  <w:style w:type="character" w:styleId="IntenseReference">
+  <w:style w:type="character" w:styleId="Rfrenceintense">
     <w:name w:val="Intense Reference"/>
-    <w:basedOn w:val="DefaultParagraphFont"/>
+    <w:basedOn w:val="Policepardfaut"/>
     <w:uiPriority w:val="32"/>
     <w:qFormat/>
     <w:rsid w:val="00054634"/>
@@ -1159,10 +1152,10 @@
       <w:spacing w:val="5"/>
     </w:rPr>
   </w:style>
-  <w:style w:type="paragraph" w:styleId="Header">
+  <w:style w:type="paragraph" w:styleId="En-tte">
     <w:name w:val="header"/>
     <w:basedOn w:val="Normal"/>
-    <w:link w:val="HeaderChar"/>
+    <w:link w:val="En-tteCar"/>
     <w:uiPriority w:val="99"/>
     <w:unhideWhenUsed/>
     <w:rsid w:val="001C1C92"/>
@@ -1174,17 +1167,17 @@
       <w:spacing w:after="0" w:line="240" w:lineRule="auto"/>
     </w:pPr>
   </w:style>
-  <w:style w:type="character" w:customStyle="1" w:styleId="HeaderChar">
-    <w:name w:val="Header Char"/>
-    <w:basedOn w:val="DefaultParagraphFont"/>
-    <w:link w:val="Header"/>
+  <w:style w:type="character" w:customStyle="1" w:styleId="En-tteCar">
+    <w:name w:val="En-tête Car"/>
+    <w:basedOn w:val="Policepardfaut"/>
+    <w:link w:val="En-tte"/>
     <w:uiPriority w:val="99"/>
     <w:rsid w:val="001C1C92"/>
   </w:style>
-  <w:style w:type="paragraph" w:styleId="Footer">
+  <w:style w:type="paragraph" w:styleId="Pieddepage">
     <w:name w:val="footer"/>
     <w:basedOn w:val="Normal"/>
-    <w:link w:val="FooterChar"/>
+    <w:link w:val="PieddepageCar"/>
     <w:uiPriority w:val="99"/>
     <w:unhideWhenUsed/>
     <w:rsid w:val="001C1C92"/>
@@ -1196,10 +1189,10 @@
       <w:spacing w:after="0" w:line="240" w:lineRule="auto"/>
     </w:pPr>
   </w:style>
-  <w:style w:type="character" w:customStyle="1" w:styleId="FooterChar">
-    <w:name w:val="Footer Char"/>
-    <w:basedOn w:val="DefaultParagraphFont"/>
-    <w:link w:val="Footer"/>
+  <w:style w:type="character" w:customStyle="1" w:styleId="PieddepageCar">
+    <w:name w:val="Pied de page Car"/>
+    <w:basedOn w:val="Policepardfaut"/>
+    <w:link w:val="Pieddepage"/>
     <w:uiPriority w:val="99"/>
     <w:rsid w:val="001C1C92"/>
   </w:style>

</xml_diff>